<commit_message>
Remove two caption caveats
</commit_message>
<xml_diff>
--- a/GeoPRR-Net_中文翻译版.docx
+++ b/GeoPRR-Net_中文翻译版.docx
@@ -12784,7 +12784,7 @@
           <w:color w:val="3F4854"/>
           <w:sz w:val="16"/>
         </w:rPr>
-        <w:t xml:space="preserve">图 3. 几何—路由交互、整体消融效应、分条件证据分配与透视角度边界。(a) 完整的 2×2“几何 × 路由”因子实验。点和误差条分别表示三个独立拟合随机种子的 NMAE 均值和样本标准差；框内交互项为预先指定的双重差分，并给出基于场景聚类、20,000 次重采样的 95% bootstrap 区间。(b) 各消融变体相对完整模型的总体 NMAE 惩罚；正值表示性能变差，水平误差条为成对场景聚类 bootstrap 95% 区间。(c) 三个随机种子上的分条件平均消融惩罚；竖线分隔干净/仅模糊条件和透视条件。(d) 预先指定诊断随机种子上的几何/基础、极坐标和关系候选平均路由权重。(e) 0°–60° 透视角度压力测试。点和误差条分别表示三个随机种子的均值和样本标准差，灰色柱表示恒等回退比例。原始 EfficientNet-B0 作为独立外部模型评估，不使用 SARN 或 GeoPRR-Net 后处理；在 60° 时，全部 1,558 张图像进入恒等回退，且仍保留在每个模型和随机种子的评估分母中。NMAE 以满量程百分比（%FS）报告，数值越低越好。</w:t>
+        <w:t xml:space="preserve">图 3. 几何—路由交互、整体消融效应、分条件证据分配与透视角度边界。(a) 完整的 2×2“几何 × 路由”因子实验。点和误差条分别表示三个独立拟合随机种子的 NMAE 均值和样本标准差；框内交互项为预先指定的双重差分，并给出基于场景聚类、20,000 次重采样的 95% bootstrap 区间。(b) 各消融变体相对完整模型的总体 NMAE 惩罚；正值表示性能变差，水平误差条为成对场景聚类 bootstrap 95% 区间。(c) 三个随机种子上的分条件平均消融惩罚；竖线分隔干净/仅模糊条件和透视条件。(d) 预先指定诊断随机种子上的几何/基础、极坐标和关系候选平均路由权重。(e) 0°–60° 透视角度压力测试。点和误差条分别表示三个随机种子的均值和样本标准差，灰色柱表示恒等回退比例。NMAE 以满量程百分比（%FS）报告，数值越低越好。</w:t>
       </w:r>
     </w:p>
     <w:p>
@@ -16862,7 +16862,7 @@
           <w:color w:val="3F4854"/>
           <w:sz w:val="16"/>
         </w:rPr>
-        <w:t>图 6. 与复现 VDN 方向组件的完整匹配比较。(a) 六种条件的汇总 NMAE。(b) 分条件 NMAE；(a,b) 中的数值为三个独立训练的最终检查点的均值±样本标准差。(c) GeoPRR-Net 减 VDN 的成对 NMAE 差异及 95% 场景自举区间，基于 14 个场景聚类和 20,000 次重复；负差异支持 GeoPRR-Net。每个随机种子在每种条件下包含 1,558 个样本，共 9,348 行。VDN 方向使用由标注导出的枢轴和有序刻度端点离线换算，因此这不是完整自动系统之间的比较。</w:t>
+        <w:t>图 6. 与复现 VDN 方向组件的完整匹配比较。(a) 六种条件的汇总 NMAE。(b) 分条件 NMAE；(a,b) 中的数值为三个独立训练的最终检查点的均值±样本标准差。(c) GeoPRR-Net 减 VDN 的成对 NMAE 差异及 95% 场景自举区间，基于 14 个场景聚类和 20,000 次重复；负差异支持 GeoPRR-Net。每个随机种子在每种条件下包含 1,558 个样本，共 9,348 行。</w:t>
       </w:r>
     </w:p>
     <w:p>

</xml_diff>